<commit_message>
Fix gaps found in self-review of the Khanin analysis homework
Add the problem question to each adjacent theme (stage b of the assignment
asks for themes, problems and episodes), relabel the stages as
form -> a) -> b) -> c), correct who burns Alla's coat and whose reasoning
the "patch the holes" quote is, and make every quotation verbatim against
the source texts and Khanin's abstract.

Co-Authored-By: Claude Opus 5.5 <noreply@anthropic.com>
Claude-Session: https://claude.ai/code/session_01A9x84f134nGQGsxR9hq96n
</commit_message>
<xml_diff>
--- a/pedagogy/Педагогический_анализ_Лиханов_Чехов.docx
+++ b/pedagogy/Педагогический_анализ_Лиханов_Чехов.docx
@@ -42,7 +42,7 @@
           <w:b/>
           <w:bCs/>
         </w:rPr>
-        <w:t xml:space="preserve">1. Форма.</w:t>
+        <w:t xml:space="preserve">Наблюдения над формой.</w:t>
       </w:r>
     </w:p>
     <w:p>
@@ -78,19 +78,19 @@
         </w:numPr>
       </w:pPr>
       <w:r>
-        <w:t xml:space="preserve">Система образов: Надя ↔ 22 сироты; педагоги (директор, завуч, Маша, Мартынова); «взрослые со стороны» (Лепестинья, Парамонов, Запорожцы, Степан Иванович); родные (мать Нади, мать Ани).</w:t>
-      </w:r>
-    </w:p>
-    <w:p>
-      <w:pPr>
-        <w:pStyle w:val="ListParagraph"/>
-        <w:numPr>
-          <w:ilvl w:val="0"/>
-          <w:numId w:val="2"/>
-        </w:numPr>
-      </w:pPr>
-      <w:r>
-        <w:t xml:space="preserve">Детали: лестница, зелёная тетрадь, сожжённая шубка; «Надежда Победоносная» → «Бедоносная» → «мама Надя».</w:t>
+        <w:t xml:space="preserve">Система образов: Надя ↔ 22 сироты; педагоги (директор, завуч, Маша, Мартынова); взрослые из гостевых семей (Лепестинья, Парамонов, Запорожцы, Степан Иванович); родные (мать Нади, мать Ани).</w:t>
+      </w:r>
+    </w:p>
+    <w:p>
+      <w:pPr>
+        <w:pStyle w:val="ListParagraph"/>
+        <w:numPr>
+          <w:ilvl w:val="0"/>
+          <w:numId w:val="2"/>
+        </w:numPr>
+      </w:pPr>
+      <w:r>
+        <w:t xml:space="preserve">Детали: лестница, зелёная тетрадь, сожжённая шубка; «Надежда Победоносная» → «Бедоносная» → «Ма-ма На-дя!».</w:t>
       </w:r>
     </w:p>
     <w:p>
@@ -103,7 +103,7 @@
           <w:b/>
           <w:bCs/>
         </w:rPr>
-        <w:t xml:space="preserve">2. а) Тема и проблема.</w:t>
+        <w:t xml:space="preserve">а) Основная педагогическая тема и проблема.</w:t>
       </w:r>
       <w:r>
         <w:t xml:space="preserve"> Тема — воспитание детей-сирот; любовь педагога и её пределы. Ситуация педагогического взаимодействия: молодая воспитательница и 22 первоклассника, у которых «никого нет»; чтобы восполнить «дефицит любви», она находит им гостевые семьи. Проблема: может ли педагог восполнить родительскую любовь и отвечает ли он за последствия своих благих намерений? («Доброта может и ранить».)</w:t>
@@ -119,91 +119,91 @@
           <w:b/>
           <w:bCs/>
         </w:rPr>
-        <w:t xml:space="preserve">3. б) Смежные темы:</w:t>
-      </w:r>
-    </w:p>
-    <w:p>
-      <w:pPr>
-        <w:pStyle w:val="ListParagraph"/>
-        <w:numPr>
-          <w:ilvl w:val="0"/>
-          <w:numId w:val="2"/>
-        </w:numPr>
-      </w:pPr>
-      <w:r>
-        <w:t xml:space="preserve">становление педагога («мокрый щенок» → «мама Надя»);</w:t>
-      </w:r>
-    </w:p>
-    <w:p>
-      <w:pPr>
-        <w:pStyle w:val="ListParagraph"/>
-        <w:numPr>
-          <w:ilvl w:val="0"/>
-          <w:numId w:val="2"/>
-        </w:numPr>
-      </w:pPr>
-      <w:r>
-        <w:t xml:space="preserve">властная любовь (мать Нади: «Ты останешься здесь!»);</w:t>
-      </w:r>
-    </w:p>
-    <w:p>
-      <w:pPr>
-        <w:pStyle w:val="ListParagraph"/>
-        <w:numPr>
-          <w:ilvl w:val="0"/>
-          <w:numId w:val="2"/>
-        </w:numPr>
-      </w:pPr>
-      <w:r>
-        <w:t xml:space="preserve">ребёнок и недостойная мать (Аня: «А мамку жалко», «я ее удочерю»);</w:t>
-      </w:r>
-    </w:p>
-    <w:p>
-      <w:pPr>
-        <w:pStyle w:val="ListParagraph"/>
-        <w:numPr>
-          <w:ilvl w:val="0"/>
-          <w:numId w:val="2"/>
-        </w:numPr>
-      </w:pPr>
-      <w:r>
-        <w:t xml:space="preserve">мнимая и подлинная доброта (Запорожцы — Лепестинья, Парамонов);</w:t>
-      </w:r>
-    </w:p>
-    <w:p>
-      <w:pPr>
-        <w:pStyle w:val="ListParagraph"/>
-        <w:numPr>
-          <w:ilvl w:val="0"/>
-          <w:numId w:val="2"/>
-        </w:numPr>
-      </w:pPr>
-      <w:r>
-        <w:t xml:space="preserve">индивидуальный подход (Коля Урванцев, зелёная тетрадь);</w:t>
-      </w:r>
-    </w:p>
-    <w:p>
-      <w:pPr>
-        <w:pStyle w:val="ListParagraph"/>
-        <w:numPr>
-          <w:ilvl w:val="0"/>
-          <w:numId w:val="2"/>
-        </w:numPr>
-      </w:pPr>
-      <w:r>
-        <w:t xml:space="preserve">коллектив и право на ошибку (директор, завуч);</w:t>
-      </w:r>
-    </w:p>
-    <w:p>
-      <w:pPr>
-        <w:pStyle w:val="ListParagraph"/>
-        <w:numPr>
-          <w:ilvl w:val="0"/>
-          <w:numId w:val="2"/>
-        </w:numPr>
-      </w:pPr>
-      <w:r>
-        <w:t xml:space="preserve">личное счастье и долг (Виктор).</w:t>
+        <w:t xml:space="preserve">б) Смежные темы, проблемы и эпизоды:</w:t>
+      </w:r>
+    </w:p>
+    <w:p>
+      <w:pPr>
+        <w:pStyle w:val="ListParagraph"/>
+        <w:numPr>
+          <w:ilvl w:val="0"/>
+          <w:numId w:val="2"/>
+        </w:numPr>
+      </w:pPr>
+      <w:r>
+        <w:t xml:space="preserve">становление педагога: призвание или случайность? — Надя: «мокрый щенок» → «Ма-ма На-дя!»;</w:t>
+      </w:r>
+    </w:p>
+    <w:p>
+      <w:pPr>
+        <w:pStyle w:val="ListParagraph"/>
+        <w:numPr>
+          <w:ilvl w:val="0"/>
+          <w:numId w:val="2"/>
+        </w:numPr>
+      </w:pPr>
+      <w:r>
+        <w:t xml:space="preserve">властная любовь: не подавляет ли она личность? — мать Нади: «Ты останешься здесь!»;</w:t>
+      </w:r>
+    </w:p>
+    <w:p>
+      <w:pPr>
+        <w:pStyle w:val="ListParagraph"/>
+        <w:numPr>
+          <w:ilvl w:val="0"/>
+          <w:numId w:val="2"/>
+        </w:numPr>
+      </w:pPr>
+      <w:r>
+        <w:t xml:space="preserve">ребёнок и недостойная мать: вправе ли педагог встать между ними? — Аня: «А мамку жалко», «я ее удочерю»;</w:t>
+      </w:r>
+    </w:p>
+    <w:p>
+      <w:pPr>
+        <w:pStyle w:val="ListParagraph"/>
+        <w:numPr>
+          <w:ilvl w:val="0"/>
+          <w:numId w:val="2"/>
+        </w:numPr>
+      </w:pPr>
+      <w:r>
+        <w:t xml:space="preserve">мнимая и подлинная доброта: кто способен заменить ребёнку родителя? — Запорожцы и Алла; Лепестинья, Парамонов;</w:t>
+      </w:r>
+    </w:p>
+    <w:p>
+      <w:pPr>
+        <w:pStyle w:val="ListParagraph"/>
+        <w:numPr>
+          <w:ilvl w:val="0"/>
+          <w:numId w:val="2"/>
+        </w:numPr>
+      </w:pPr>
+      <w:r>
+        <w:t xml:space="preserve">индивидуальный подход: как воспитывать «в глубину», если на всех не хватает? — Коля Урванцев, зелёная тетрадь;</w:t>
+      </w:r>
+    </w:p>
+    <w:p>
+      <w:pPr>
+        <w:pStyle w:val="ListParagraph"/>
+        <w:numPr>
+          <w:ilvl w:val="0"/>
+          <w:numId w:val="2"/>
+        </w:numPr>
+      </w:pPr>
+      <w:r>
+        <w:t xml:space="preserve">коллектив и право на ошибку: где граница между риском и безответственностью? — директор, завуч («Доброта должна быть разумной»);</w:t>
+      </w:r>
+    </w:p>
+    <w:p>
+      <w:pPr>
+        <w:pStyle w:val="ListParagraph"/>
+        <w:numPr>
+          <w:ilvl w:val="0"/>
+          <w:numId w:val="2"/>
+        </w:numPr>
+      </w:pPr>
+      <w:r>
+        <w:t xml:space="preserve">личное счастье и долг: обязательна ли жертвенность? — Виктор: «время самоотверженности в педагогике кончилось».</w:t>
       </w:r>
     </w:p>
     <w:p>
@@ -226,7 +226,7 @@
           <w:b/>
           <w:bCs/>
         </w:rPr>
-        <w:t xml:space="preserve">1. Форма.</w:t>
+        <w:t xml:space="preserve">Наблюдения над формой.</w:t>
       </w:r>
     </w:p>
     <w:p>
@@ -311,10 +311,10 @@
           <w:b/>
           <w:bCs/>
         </w:rPr>
-        <w:t xml:space="preserve">2. а) Тема и проблема.</w:t>
-      </w:r>
-      <w:r>
-        <w:t xml:space="preserve"> Тема — передача духовного опыта через живое слово и сопереживание. Ситуация педагогического взаимодействия: будущий пастырь рассказывает вдовам евангельскую историю, и их отклик преображает его самого. Проблема: в чём сила воспитательного слова — в умении рассказывать или в причастности слушателя? Ответ: не потому, что он «умеет трогательно рассказывать», а потому, что «Петр ей близок».</w:t>
+        <w:t xml:space="preserve">а) Основная педагогическая тема и проблема.</w:t>
+      </w:r>
+      <w:r>
+        <w:t xml:space="preserve"> Тема — передача духовного опыта через живое слово и сопереживание. Ситуация педагогического взаимодействия: будущий пастырь рассказывает вдовам евангельскую историю, и их отклик преображает его самого. Проблема: в чём сила воспитательного слова — в умении рассказывать или в причастности слушателя? Ответ героя: старуха заплакала не потому, что он «умеет трогательно рассказывать», а потому, что «Петр ей близок».</w:t>
       </w:r>
     </w:p>
     <w:p>
@@ -327,91 +327,91 @@
           <w:b/>
           <w:bCs/>
         </w:rPr>
-        <w:t xml:space="preserve">3. б) Смежные темы:</w:t>
-      </w:r>
-    </w:p>
-    <w:p>
-      <w:pPr>
-        <w:pStyle w:val="ListParagraph"/>
-        <w:numPr>
-          <w:ilvl w:val="0"/>
-          <w:numId w:val="2"/>
-        </w:numPr>
-      </w:pPr>
-      <w:r>
-        <w:t xml:space="preserve">становление мировоззрения юноши (от безнадёжности к смыслу);</w:t>
-      </w:r>
-    </w:p>
-    <w:p>
-      <w:pPr>
-        <w:pStyle w:val="ListParagraph"/>
-        <w:numPr>
-          <w:ilvl w:val="0"/>
-          <w:numId w:val="2"/>
-        </w:numPr>
-      </w:pPr>
-      <w:r>
-        <w:t xml:space="preserve">переживание и со-переживание (слёзы Петра и Василисы);</w:t>
-      </w:r>
-    </w:p>
-    <w:p>
-      <w:pPr>
-        <w:pStyle w:val="ListParagraph"/>
-        <w:numPr>
-          <w:ilvl w:val="0"/>
-          <w:numId w:val="2"/>
-        </w:numPr>
-      </w:pPr>
-      <w:r>
-        <w:t xml:space="preserve">культурная преемственность («непрерывною цепью событий»);</w:t>
-      </w:r>
-    </w:p>
-    <w:p>
-      <w:pPr>
-        <w:pStyle w:val="ListParagraph"/>
-        <w:numPr>
-          <w:ilvl w:val="0"/>
-          <w:numId w:val="2"/>
-        </w:numPr>
-      </w:pPr>
-      <w:r>
-        <w:t xml:space="preserve">искусство педагогического слова («петел, то есть петух»);</w:t>
-      </w:r>
-    </w:p>
-    <w:p>
-      <w:pPr>
-        <w:pStyle w:val="ListParagraph"/>
-        <w:numPr>
-          <w:ilvl w:val="0"/>
-          <w:numId w:val="2"/>
-        </w:numPr>
-      </w:pPr>
-      <w:r>
-        <w:t xml:space="preserve">духовная чуткость простого человека (Лукерья);</w:t>
-      </w:r>
-    </w:p>
-    <w:p>
-      <w:pPr>
-        <w:pStyle w:val="ListParagraph"/>
-        <w:numPr>
-          <w:ilvl w:val="0"/>
-          <w:numId w:val="2"/>
-        </w:numPr>
-      </w:pPr>
-      <w:r>
-        <w:t xml:space="preserve">вина и раскаяние (отречение Петра);</w:t>
-      </w:r>
-    </w:p>
-    <w:p>
-      <w:pPr>
-        <w:pStyle w:val="ListParagraph"/>
-        <w:numPr>
-          <w:ilvl w:val="0"/>
-          <w:numId w:val="2"/>
-        </w:numPr>
-      </w:pPr>
-      <w:r>
-        <w:t xml:space="preserve">дом («не хотелось домой» → взгляд «на свою родную деревню»).</w:t>
+        <w:t xml:space="preserve">б) Смежные темы, проблемы и эпизоды:</w:t>
+      </w:r>
+    </w:p>
+    <w:p>
+      <w:pPr>
+        <w:pStyle w:val="ListParagraph"/>
+        <w:numPr>
+          <w:ilvl w:val="0"/>
+          <w:numId w:val="2"/>
+        </w:numPr>
+      </w:pPr>
+      <w:r>
+        <w:t xml:space="preserve">становление мировоззрения юноши: что выводит из безнадёжности? — «жизнь не станет лучше» → «ожидание счастья»;</w:t>
+      </w:r>
+    </w:p>
+    <w:p>
+      <w:pPr>
+        <w:pStyle w:val="ListParagraph"/>
+        <w:numPr>
+          <w:ilvl w:val="0"/>
+          <w:numId w:val="2"/>
+        </w:numPr>
+      </w:pPr>
+      <w:r>
+        <w:t xml:space="preserve">переживание и со-переживание: что делает слово действенным? — слёзы Петра и Василисы;</w:t>
+      </w:r>
+    </w:p>
+    <w:p>
+      <w:pPr>
+        <w:pStyle w:val="ListParagraph"/>
+        <w:numPr>
+          <w:ilvl w:val="0"/>
+          <w:numId w:val="2"/>
+        </w:numPr>
+      </w:pPr>
+      <w:r>
+        <w:t xml:space="preserve">культурная преемственность: как прошлое касается настоящего? — «непрерывною цепью событий»;</w:t>
+      </w:r>
+    </w:p>
+    <w:p>
+      <w:pPr>
+        <w:pStyle w:val="ListParagraph"/>
+        <w:numPr>
+          <w:ilvl w:val="0"/>
+          <w:numId w:val="2"/>
+        </w:numPr>
+      </w:pPr>
+      <w:r>
+        <w:t xml:space="preserve">искусство педагогического слова: как говорить, чтобы услышали? — «петел, то есть петух», «как вот я теперь»;</w:t>
+      </w:r>
+    </w:p>
+    <w:p>
+      <w:pPr>
+        <w:pStyle w:val="ListParagraph"/>
+        <w:numPr>
+          <w:ilvl w:val="0"/>
+          <w:numId w:val="2"/>
+        </w:numPr>
+      </w:pPr>
+      <w:r>
+        <w:t xml:space="preserve">духовная чуткость простого человека: зависит ли она от образования? — Лукерья «как у глухонемой»;</w:t>
+      </w:r>
+    </w:p>
+    <w:p>
+      <w:pPr>
+        <w:pStyle w:val="ListParagraph"/>
+        <w:numPr>
+          <w:ilvl w:val="0"/>
+          <w:numId w:val="2"/>
+        </w:numPr>
+      </w:pPr>
+      <w:r>
+        <w:t xml:space="preserve">вина и раскаяние: как любовь уживается со слабостью? — отречение Петра, «плакася горько»;</w:t>
+      </w:r>
+    </w:p>
+    <w:p>
+      <w:pPr>
+        <w:pStyle w:val="ListParagraph"/>
+        <w:numPr>
+          <w:ilvl w:val="0"/>
+          <w:numId w:val="2"/>
+        </w:numPr>
+      </w:pPr>
+      <w:r>
+        <w:t xml:space="preserve">дом: почему герою «не хотелось домой»? — бедный дом студента → взгляд «на свою родную деревню».</w:t>
       </w:r>
     </w:p>
     <w:p>
@@ -422,7 +422,7 @@
         <w:jc w:val="left"/>
       </w:pPr>
       <w:r>
-        <w:t xml:space="preserve">Лист 2. Интерпретация: педагогический смысл повести А. Лиханова «Благие намерения»</w:t>
+        <w:t xml:space="preserve">Лист 2. в) Интерпретация: педагогический смысл повести А. Лиханова «Благие намерения»</w:t>
       </w:r>
     </w:p>
     <w:p>
@@ -440,16 +440,16 @@
         <w:jc w:val="both"/>
       </w:pPr>
       <w:r>
-        <w:t xml:space="preserve">Ситуация педагогического взаимодействия — молодая воспитательница и двадцать два первоклассника-сироты — выстроена как «педагогический эксперимент» во «второй» реальности (В. Н. Ханин). Надежда верно понимает, что детям «нужен дом. Родные люди», а педагогов на всех не хватит. Её решение найти малышам гостевые семьи продиктовано любовью. Но любовь без знания людей оборачивается новой травмой: дети, прикоснувшись к семейному теплу, теряют его. Так «взрослая» идея находит свой «предел» и проверяется нравственной правдой ребёнка. Аня выбирает свою «родительницу» и мечтает: «я ее удочерю», Алла сжигает подаренную шубку, Сева бросает: «А вам-то какое дело!» Дети учат взрослого: «мы поменялись местами», — признаёт героиня. Воспитание показано не как «внешнее» воздействие, а как диалог, в котором меняются оба участника.</w:t>
-      </w:r>
-    </w:p>
-    <w:p>
-      <w:pPr>
-        <w:ind w:firstLine="709"/>
-        <w:jc w:val="both"/>
-      </w:pPr>
-      <w:r>
-        <w:t xml:space="preserve">Повесть сопоставляет разные типы взрослой любви: властную (мать героини: «Ты останешься здесь!»), потребительскую (Запорожцы, откупающиеся вещами) и подлинную (Лепестинья, Парамонов, Мартынова с её заповедью «Люби, если можешь. Растворись в них. А не можешь — уйди»). Автор утверждает, что педагог «может залатать дыры», но «никогда не сможет… заменить родителей», а задача школы — быть для ребёнка «нерушимой опорой».</w:t>
+        <w:t xml:space="preserve">Ситуация педагогического взаимодействия — молодая воспитательница и двадцать два первоклассника-сироты — сопоставима с «педагогическим экспериментом», совершаемым во «второй» — художественной — реальности (В. Н. Ханин). Надежда верно понимает, что детям «нужен дом. Родные люди», а педагогов на всех не хватит. Её решение найти малышам гостевые семьи продиктовано любовью. Но любовь без знания людей оборачивается новой травмой: дети, прикоснувшись к семейному теплу, теряют его. Так «взрослая» идея находит свой «предел» и проверяется нравственной правдой ребёнка. Аня остаётся верна матери (героиня различает слова «мать» и «родительница») и мечтает: «я ее удочерю»; Алла решает «расправиться с прошлым» — сжечь подаренную шубку; Сева бросает: «А вам-то какое дело!» Дети учат взрослого: «мы поменялись местами», — признаёт героиня. Воспитание показано не как ряд «внешних» воздействий, а как диалог, в котором меняются оба участника.</w:t>
+      </w:r>
+    </w:p>
+    <w:p>
+      <w:pPr>
+        <w:ind w:firstLine="709"/>
+        <w:jc w:val="both"/>
+      </w:pPr>
+      <w:r>
+        <w:t xml:space="preserve">Повесть сопоставляет разные типы взрослой любви: властную (мать героини: «Ты останешься здесь!»), потребительскую (Запорожцы, откупающиеся вещами) и подлинную (Лепестинья, Парамонов, Мартынова с её заповедью «Люби, если можешь. Растворись в них. А не можешь — уйди»). После встречи с Мартыновой героиня понимает, что педагог «может залатать дыры», но «никогда не сможет… заменить родителей», а задача школы — остаться для ребёнка «нерушимой опорой».</w:t>
       </w:r>
     </w:p>
     <w:p>
@@ -487,7 +487,7 @@
         <w:jc w:val="left"/>
       </w:pPr>
       <w:r>
-        <w:t xml:space="preserve">Лист 3. Интерпретация: педагогический смысл рассказа А. П. Чехова «Студент»</w:t>
+        <w:t xml:space="preserve">Лист 3. в) Интерпретация: педагогический смысл рассказа А. П. Чехова «Студент»</w:t>
       </w:r>
     </w:p>
     <w:p>
@@ -514,7 +514,7 @@
         <w:jc w:val="both"/>
       </w:pPr>
       <w:r>
-        <w:t xml:space="preserve">Отклик женщин — слёзы Василисы и лицо Лукерьи, как у человека, «который сдерживает сильную боль», — становится уроком для самого рассказчика: учащий оказывается научен. Студент понимает, что старуха заплакала «не потому, что он умеет трогательно рассказывать, а потому, что Петр ей близок». Значит, воспитывает не техника и не «внешнее» воздействие, а переживание, ставшее со-переживанием. Именно переживание В. Н. Ханин считает главным воспитательным фактором в русской литературе. А мысль М. М. Бахтина о том, что при понимании нужны «как минимум два» сознания, получает здесь художественное воплощение.</w:t>
+        <w:t xml:space="preserve">Отклик женщин — слёзы Василисы и лицо Лукерьи, как у человека, «который сдерживает сильную боль», — становится уроком для самого рассказчика: учащий оказывается научен. Студент понимает, что старуха заплакала «не потому, что он умеет трогательно рассказывать, а потому, что Петр ей близок». Значит, воспитывает не техника и не ряд «внешних» воздействий, а переживание, ставшее со-переживанием. По В. Н. Ханину, для русских писателей переживание «является единственным воспитательным фактором», «сущностно, содержательно» влияющим на внутренний мир человека. А мысль М. М. Бахтина о том, что при понимании нужны «как минимум два» сознания, получает здесь художественное воплощение.</w:t>
       </w:r>
     </w:p>
     <w:p>
@@ -541,7 +541,7 @@
         <w:jc w:val="both"/>
       </w:pPr>
       <w:r>
-        <w:t xml:space="preserve">Значимы и образы слушательниц. Василиса когда-то служила у господ «в мамках, а потом няньках», то есть сама была воспитательницей. Забитая мужем Лукерья с лицом «как у глухонемой» понимает рассказ глубже всех. Перед правдой «просвещённый» и «простые» равны.</w:t>
+        <w:t xml:space="preserve">Значимы и образы слушательниц. Василиса когда-то служила у господ «в мамках, а потом няньках», то есть сама была воспитательницей. Забитая мужем Лукерья с лицом «как у глухонемой» откликается на рассказ всем существом, не произнеся ни слова. Перед правдой «просвещённый» и «простые» равны.</w:t>
       </w:r>
     </w:p>
     <w:p>

</xml_diff>

<commit_message>
Rewrite the interpretations in a plainer student voice
Drop the stacked "not X but Y" antitheses, triple parallels and aphoristic
paragraph endings; use simpler sentences and first-person judgments.
Content and verbatim quotations are unchanged.

Co-Authored-By: Claude Opus 5.5 <noreply@anthropic.com>
Claude-Session: https://claude.ai/code/session_01A9x84f134nGQGsxR9hq96n
</commit_message>
<xml_diff>
--- a/pedagogy/Педагогический_анализ_Лиханов_Чехов.docx
+++ b/pedagogy/Педагогический_анализ_Лиханов_Чехов.docx
@@ -431,52 +431,52 @@
         <w:jc w:val="both"/>
       </w:pPr>
       <w:r>
-        <w:t xml:space="preserve">Заглавие повести опирается на пословицу «Благими намерениями вымощена дорога в ад», но смысл произведения строится как спор с ней. В тексте пословицу произносит «князь» Игорь Запорожец, оправдывая свой отказ от Аллочки. Итог авторской мысли формулирует героиня: «дорога-то в ад вымощена не намерениями, а намерениями неисполненными». Главная педагогическая идея повести, на мой взгляд, такова: ценность воспитательного поступка определяется не чистотой замысла, а готовностью довести его до конца и ответить за последствия.</w:t>
-      </w:r>
-    </w:p>
-    <w:p>
-      <w:pPr>
-        <w:ind w:firstLine="709"/>
-        <w:jc w:val="both"/>
-      </w:pPr>
-      <w:r>
-        <w:t xml:space="preserve">Ситуация педагогического взаимодействия — молодая воспитательница и двадцать два первоклассника-сироты — сопоставима с «педагогическим экспериментом», совершаемым во «второй» — художественной — реальности (В. Н. Ханин). Надежда верно понимает, что детям «нужен дом. Родные люди», а педагогов на всех не хватит. Её решение найти малышам гостевые семьи продиктовано любовью. Но любовь без знания людей оборачивается новой травмой: дети, прикоснувшись к семейному теплу, теряют его. Так «взрослая» идея находит свой «предел» и проверяется нравственной правдой ребёнка. Аня остаётся верна матери (героиня различает слова «мать» и «родительница») и мечтает: «я ее удочерю»; Алла решает «расправиться с прошлым» — сжечь подаренную шубку; Сева бросает: «А вам-то какое дело!» Дети учат взрослого: «мы поменялись местами», — признаёт героиня. Воспитание показано не как ряд «внешних» воздействий, а как диалог, в котором меняются оба участника.</w:t>
-      </w:r>
-    </w:p>
-    <w:p>
-      <w:pPr>
-        <w:ind w:firstLine="709"/>
-        <w:jc w:val="both"/>
-      </w:pPr>
-      <w:r>
-        <w:t xml:space="preserve">Повесть сопоставляет разные типы взрослой любви: властную (мать героини: «Ты останешься здесь!»), потребительскую (Запорожцы, откупающиеся вещами) и подлинную (Лепестинья, Парамонов, Мартынова с её заповедью «Люби, если можешь. Растворись в них. А не можешь — уйди»). После встречи с Мартыновой героиня понимает, что педагог «может залатать дыры», но «никогда не сможет… заменить родителей», а задача школы — остаться для ребёнка «нерушимой опорой».</w:t>
-      </w:r>
-    </w:p>
-    <w:p>
-      <w:pPr>
-        <w:ind w:firstLine="709"/>
-        <w:jc w:val="both"/>
-      </w:pPr>
-      <w:r>
-        <w:t xml:space="preserve">Важна и форма повести: это исповедь, разбор собственных ошибок. Такую педагогику Лиханов утверждает в статье «Именем доброты», открывающей «Драматическую педагогику». Педагогика, по его словам, — «дисциплина неточная»; она должна анализировать и те ситуации, когда учитель «оказался побежденным», а «самое дурное… — воспитатель, не признающий… своих ошибок». Повесть и есть такой художественный разбор ошибки. Поэтому итоговый счёт — шестнадцать удач против шести неудач — героиню не оправдывает: «Я про шестерых». Каждый ребёнок для педагога — не процент, а судьба.</w:t>
-      </w:r>
-    </w:p>
-    <w:p>
-      <w:pPr>
-        <w:ind w:firstLine="709"/>
-        <w:jc w:val="both"/>
-      </w:pPr>
-      <w:r>
-        <w:t xml:space="preserve">Наконец, это повесть о становлении педагога. «Мокрый щенок», жалеющий себя, через чужую боль учится состраданию, через ошибки — ответственности, через отказ от личного счастья — верности. Кольцевая композиция с цветущей черёмухой и криком «Ма-ма На-дя!» показывает, что ей удалось «осушать болото, пока на его месте не зацветут сады». Но финал открыт: интернату снова дают первоклашек-сирот.</w:t>
-      </w:r>
-    </w:p>
-    <w:p>
-      <w:pPr>
-        <w:ind w:firstLine="709"/>
-        <w:jc w:val="both"/>
-      </w:pPr>
-      <w:r>
-        <w:t xml:space="preserve">Итак, любовь — главный инструмент воспитателя, но она должна быть разумной и ответственной. Педагог имеет право на ошибку, но не имеет права её не признать и оставить тех, кого она задела. Воспитать человека можно, «только отдав ему часть себя».</w:t>
+        <w:t xml:space="preserve">Название повести взято из пословицы «Благими намерениями вымощена дорога в ад». Но мне кажется, что вся повесть написана как спор с этой пословицей. Интересно, что в тексте её произносит «князь» Игорь Запорожец, когда отказывается от Аллочки, то есть как раз человек, который не довёл начатое до конца. Героиня приходит к другому выводу: «дорога-то в ад вымощена не намерениями, а намерениями неисполненными». Я думаю, в этом и состоит главная педагогическая идея повести: мало хотеть детям добра, нужно ещё отвечать за то, что из этого вышло.</w:t>
+      </w:r>
+    </w:p>
+    <w:p>
+      <w:pPr>
+        <w:ind w:firstLine="709"/>
+        <w:jc w:val="both"/>
+      </w:pPr>
+      <w:r>
+        <w:t xml:space="preserve">Ситуация педагогического взаимодействия здесь такая: молодая воспитательница и двадцать два первоклассника-сироты. Ханин сравнивает изображённое в художественном тексте с «педагогическим экспериментом», совершаемым во «второй» — художественной — реальности, и к этой повести это очень подходит. Надежда понимает, что детям «нужен дом. Родные люди», а воспитателей на всех не хватит, и находит малышам семьи, которые берут их на выходные. Сначала всё идёт хорошо, но потом оказывается, что не все взрослые готовы к такой ответственности. Дети привыкают к семье и теряют её, и для них это новая травма. Здесь «взрослая» идея, как пишет Ханин, находит свой «предел», и проверяют её сами дети. Аня остаётся верна матери (героиня различает слова «мать» и «родительница») и мечтает: «я ее удочерю». Алла решает «расправиться с прошлым» и сжечь подаренную шубку. Сева, когда уезжает Степан Иванович, говорит воспитательнице: «А вам-то какое дело!» Героиня признаёт, что иногда они с детьми как будто «поменялись местами». Получается, что воспитание в повести идёт в обе стороны и меняет самого воспитателя.</w:t>
+      </w:r>
+    </w:p>
+    <w:p>
+      <w:pPr>
+        <w:ind w:firstLine="709"/>
+        <w:jc w:val="both"/>
+      </w:pPr>
+      <w:r>
+        <w:t xml:space="preserve">В повести показана разная любовь взрослых к детям. Мать героини любит её властно и не даёт решать самой («Ты останешься здесь!»). Запорожцы относятся к Алле почти как к игрушке и откупаются от неё подарками. По-настоящему любят детей Лепестинья, Парамонов и старая Мартынова, которая говорит Наде: «Люби, если можешь. Растворись в них. А не можешь — уйди». После разговора с ней героиня понимает, что педагог «может залатать дыры», но «никогда не сможет… заменить родителей».</w:t>
+      </w:r>
+    </w:p>
+    <w:p>
+      <w:pPr>
+        <w:ind w:firstLine="709"/>
+        <w:jc w:val="both"/>
+      </w:pPr>
+      <w:r>
+        <w:t xml:space="preserve">Мне кажется важным, что повесть построена как воспоминание, в котором героиня разбирает свои ошибки. Об этом же Лиханов пишет в статье «Именем доброты», которая открывает «Драматическую педагогику». По его словам, педагогика — «дисциплина неточная», и разбирать нужно в том числе случаи, когда учитель «оказался побежденным». Хуже всего он считает воспитателя, который не признаёт своих ошибок. Повесть как раз и есть такой разбор. Поэтому героиню не успокаивает итог года: шестнадцать детей нашли семью или друзей, а шестеро перестали ходить в гости и остались в интернате. Она пишет: «Я про шестерых».</w:t>
+      </w:r>
+    </w:p>
+    <w:p>
+      <w:pPr>
+        <w:ind w:firstLine="709"/>
+        <w:jc w:val="both"/>
+      </w:pPr>
+      <w:r>
+        <w:t xml:space="preserve">Ещё это повесть о том, как Надежда становится учительницей. В начале она называет себя «мокрым щенком», который думает только о своих печалях. Потом она остаётся со своим классом до самого выпуска, хотя из-за этого расстаётся с Виктором. В последней главе выпускники кричат ей под окном «Ма-ма На-дя!». Но финал всё-таки открытый: интернату снова дают первоклассников из детского дома, и неизвестно, как поступит героиня.</w:t>
+      </w:r>
+    </w:p>
+    <w:p>
+      <w:pPr>
+        <w:ind w:firstLine="709"/>
+        <w:jc w:val="both"/>
+      </w:pPr>
+      <w:r>
+        <w:t xml:space="preserve">По-моему, Лиханов показывает, что без любви воспитателю не обойтись, но любовь должна быть разумной и ответственной. Педагог может ошибиться, но должен признать ошибку и не оставлять тех, кого она задела. Как говорит сама героиня, воспитать человека можно, «только отдав ему часть себя».</w:t>
       </w:r>
     </w:p>
     <w:p>
@@ -496,61 +496,61 @@
         <w:jc w:val="both"/>
       </w:pPr>
       <w:r>
-        <w:t xml:space="preserve">В рассказе нет ни школы, ни учителя, ни ученика, но именно поэтому в нём, как в чистом опыте, видна суть педагогического взаимодействия: встреча людей, живое слово и отклик, который меняет обоих.</w:t>
-      </w:r>
-    </w:p>
-    <w:p>
-      <w:pPr>
-        <w:ind w:firstLine="709"/>
-        <w:jc w:val="both"/>
-      </w:pPr>
-      <w:r>
-        <w:t xml:space="preserve">В начале студент духовной академии, будущий пастырь, сам нуждается в утешении: ему кажется, что бедность и тоска «были, есть и будут» и «жизнь не станет лучше». У костра он никого не поучает, а рассказывает вдовам об отречении Петра как человек, переживающий событие: «Ах, какая то была страшная ночь, бабушка!» Он «переводит» Евангелие на язык слушательниц («петел, то есть петух»), опирается на их опыт («Небось, была на двенадцати евангелиях?») и ставит себя на место Петра («грелся, как вот я теперь»). Так прошлое становится настоящим.</w:t>
-      </w:r>
-    </w:p>
-    <w:p>
-      <w:pPr>
-        <w:ind w:firstLine="709"/>
-        <w:jc w:val="both"/>
-      </w:pPr>
-      <w:r>
-        <w:t xml:space="preserve">Отклик женщин — слёзы Василисы и лицо Лукерьи, как у человека, «который сдерживает сильную боль», — становится уроком для самого рассказчика: учащий оказывается научен. Студент понимает, что старуха заплакала «не потому, что он умеет трогательно рассказывать, а потому, что Петр ей близок». Значит, воспитывает не техника и не ряд «внешних» воздействий, а переживание, ставшее со-переживанием. По В. Н. Ханину, для русских писателей переживание «является единственным воспитательным фактором», «сущностно, содержательно» влияющим на внутренний мир человека. А мысль М. М. Бахтина о том, что при понимании нужны «как минимум два» сознания, получает здесь художественное воплощение.</w:t>
-      </w:r>
-    </w:p>
-    <w:p>
-      <w:pPr>
-        <w:ind w:firstLine="709"/>
-        <w:jc w:val="both"/>
-      </w:pPr>
-      <w:r>
-        <w:t xml:space="preserve">Формула героя «дотронулся до одного конца, как дрогнул другой» — образ самого педагогического действия: учитель узнаёт о результате только по отклику другого человека. Рассказ раскрывает и механизм культурной преемственности: опыт прошлого передаётся, когда человек чувствует, что событие «имеет отношение к настоящему… ко всем людям». В начале студент видит в истории цепь зла (Рюрик, Грозный, «тысяча лет» бедности), в конце — другую цепь: «правда и красота» «всегда составляли главное в человеческой жизни». Это, по Чехову, и есть подлинное содержание воспитания.</w:t>
-      </w:r>
-    </w:p>
-    <w:p>
-      <w:pPr>
-        <w:ind w:firstLine="709"/>
-        <w:jc w:val="both"/>
-      </w:pPr>
-      <w:r>
-        <w:t xml:space="preserve">Внешний мир при этом не меняется: «возвращалась зима, и не было похоже, что послезавтра Пасха». Меняется смысловая картина мира героя: в двадцать два года на смену безнадёжности приходит «невыразимо сладкое ожидание счастья». Переправа на пароме и подъём на гору — образы внутреннего перехода, а действие в Страстную пятницу позволяет понять пережитое как внутреннее «воскресение».</w:t>
-      </w:r>
-    </w:p>
-    <w:p>
-      <w:pPr>
-        <w:ind w:firstLine="709"/>
-        <w:jc w:val="both"/>
-      </w:pPr>
-      <w:r>
-        <w:t xml:space="preserve">Значимы и образы слушательниц. Василиса когда-то служила у господ «в мамках, а потом няньках», то есть сама была воспитательницей. Забитая мужем Лукерья с лицом «как у глухонемой» откликается на рассказ всем существом, не произнеся ни слова. Перед правдой «просвещённый» и «простые» равны.</w:t>
-      </w:r>
-    </w:p>
-    <w:p>
-      <w:pPr>
-        <w:ind w:firstLine="709"/>
-        <w:jc w:val="both"/>
-      </w:pPr>
-      <w:r>
-        <w:t xml:space="preserve">Итак, воспитание, по Чехову, — не передача готовых правил, а диалог. Через живое слово и переживание человек соединяется с культурным опытом и обретает смысл жизни, а учитель растёт вместе с тем, кого учит.</w:t>
+        <w:t xml:space="preserve">В «Студенте» нет школы и учеников, но, по-моему, это очень педагогический рассказ. В нём есть то, что бывает в любом настоящем воспитании: один человек говорит, другой откликается, и от этого меняются оба.</w:t>
+      </w:r>
+    </w:p>
+    <w:p>
+      <w:pPr>
+        <w:ind w:firstLine="709"/>
+        <w:jc w:val="both"/>
+      </w:pPr>
+      <w:r>
+        <w:t xml:space="preserve">Студент духовной академии Иван Великопольский в начале рассказа сам в плохом настроении. Ему холодно и голодно, он думает, что бедность и тоска «были, есть и будут» и «жизнь не станет лучше». У костра он не собирается никого учить. Он просто вспоминает, что Пётр тоже грелся у костра, и рассказывает вдовам евангельскую историю. Рассказывает он не как проповедник, а как человек, который сам всё это переживает: «Ах, какая то была страшная ночь, бабушка!» Он объясняет непонятные слова («петел, то есть петух»), опирается на то, что женщины знают сами («Небось, была на двенадцати евангелиях?»), и сравнивает Петра с собой («грелся, как вот я теперь»). Поэтому давняя история становится слушательницам близкой.</w:t>
+      </w:r>
+    </w:p>
+    <w:p>
+      <w:pPr>
+        <w:ind w:firstLine="709"/>
+        <w:jc w:val="both"/>
+      </w:pPr>
+      <w:r>
+        <w:t xml:space="preserve">Василиса плачет, а Лукерья краснеет, и выражение у неё как у человека, «который сдерживает сильную боль». И этот отклик учит самого студента. Он понимает, что старуха заплакала «не потому, что он умеет трогательно рассказывать, а потому, что Петр ей близок». Мне кажется, это главная педагогическая мысль рассказа: на человека действует не умение рассказчика, а то, что он сам переживает услышанное. Ханин пишет, что для русских писателей переживание «является единственным воспитательным фактором». А у Бахтина сказано, что при понимании нужны «как минимум два» сознания. В «Студенте» это хорошо видно: смысл истории открылся студенту, только когда он увидел, как её поняли другие.</w:t>
+      </w:r>
+    </w:p>
+    <w:p>
+      <w:pPr>
+        <w:ind w:firstLine="709"/>
+        <w:jc w:val="both"/>
+      </w:pPr>
+      <w:r>
+        <w:t xml:space="preserve">Слова «дотронулся до одного конца, как дрогнул другой» можно отнести и к работе учителя. Учитель тоже узнаёт, получилось ли у него что-то, только по тому, как откликнулся ученик. Кроме того, рассказ показывает, как передаётся опыт прошлых поколений. Прошлое оживает, когда человек чувствует, что оно «имеет отношение к настоящему… ко всем людям». Сначала студент видел в истории только бедность и голод при Рюрике и Грозном, а в конце думает о том, что «правда и красота» «всегда составляли главное в человеческой жизни». Я думаю, именно это Чехов считает самым важным, что люди передают друг другу.</w:t>
+      </w:r>
+    </w:p>
+    <w:p>
+      <w:pPr>
+        <w:ind w:firstLine="709"/>
+        <w:jc w:val="both"/>
+      </w:pPr>
+      <w:r>
+        <w:t xml:space="preserve">При этом вокруг ничего не изменилось: «возвращалась зима, и не было похоже, что послезавтра Пасха». Изменился сам герой. Ему двадцать два года, и вместо безнадёжности у него появляется «невыразимо сладкое ожидание счастья». Он переправляется на пароме и поднимается на гору, и это тоже похоже на переход в новое состояние. Действие происходит в Страстную пятницу, перед Пасхой, поэтому то, что случилось с героем, можно понять как маленькое внутреннее воскресение.</w:t>
+      </w:r>
+    </w:p>
+    <w:p>
+      <w:pPr>
+        <w:ind w:firstLine="709"/>
+        <w:jc w:val="both"/>
+      </w:pPr>
+      <w:r>
+        <w:t xml:space="preserve">Интересно и то, кто слушает студента. Василиса когда-то служила у господ «в мамках, а потом няньках», то есть сама воспитывала детей. Лукерья забита мужем и молчит, но слушает внимательнее всех. Чехов показывает, что простые люди понимают такие вещи не хуже образованных.</w:t>
+      </w:r>
+    </w:p>
+    <w:p>
+      <w:pPr>
+        <w:ind w:firstLine="709"/>
+        <w:jc w:val="both"/>
+      </w:pPr>
+      <w:r>
+        <w:t xml:space="preserve">В итоге я понимаю этот рассказ так. Воспитание, по Чехову, — это разговор, в котором человек через живое слово и переживание связывается с опытом прошлых поколений и находит смысл жизни. И учитель в таком разговоре учится сам.</w:t>
       </w:r>
     </w:p>
     <w:sectPr>
@@ -799,7 +799,7 @@
     </w:rPrDefault>
     <w:pPrDefault>
       <w:pPr>
-        <w:spacing w:after="80" w:line="288"/>
+        <w:spacing w:after="60" w:line="276"/>
       </w:pPr>
     </w:pPrDefault>
   </w:docDefaults>

</xml_diff>